<commit_message>
Se actualizaron documentos anteriores y se agregaron los requisitos del sistema
</commit_message>
<xml_diff>
--- a/02_Analisis_de_requerimientos_y_casos_de_uso/Diagramas-Casos-de-Uso-Sistema-Tutorias.docx
+++ b/02_Analisis_de_requerimientos_y_casos_de_uso/Diagramas-Casos-de-Uso-Sistema-Tutorias.docx
@@ -14,9 +14,9 @@
           <w:szCs w:val="28"/>
         </w:rPr>
       </w:pPr>
-      <w:bookmarkStart w:id="0" w:name="_Toc452014994"/>
+      <w:bookmarkStart w:id="0" w:name="_Toc452014848"/>
       <w:bookmarkStart w:id="1" w:name="_Toc436856824"/>
-      <w:bookmarkStart w:id="2" w:name="_Toc452014848"/>
+      <w:bookmarkStart w:id="2" w:name="_Toc452014994"/>
       <w:r>
         <w:drawing>
           <wp:anchor distT="0" distB="0" distL="0" distR="0" simplePos="0" relativeHeight="2" behindDoc="1" locked="0" layoutInCell="1" allowOverlap="1">
@@ -184,7 +184,7 @@
                         <w:txbxContent>
                           <w:p>
                             <w:pPr>
-                              <w:pStyle w:val="FrameContents"/>
+                              <w:pStyle w:val="FrameContentsuser"/>
                               <w:spacing w:before="0" w:after="160"/>
                               <w:ind w:end="11"/>
                               <w:jc w:val="center"/>
@@ -268,7 +268,7 @@
                   <w:txbxContent>
                     <w:p>
                       <w:pPr>
-                        <w:pStyle w:val="FrameContents"/>
+                        <w:pStyle w:val="FrameContentsuser"/>
                         <w:spacing w:before="0" w:after="160"/>
                         <w:ind w:end="11"/>
                         <w:jc w:val="center"/>
@@ -791,19 +791,7 @@
         <w:rPr>
           <w:rFonts w:eastAsia="Arial" w:cs="Arial"/>
         </w:rPr>
-        <w:t xml:space="preserve">Este documento presenta los </w:t>
-      </w:r>
-      <w:r>
-        <w:rPr>
-          <w:rFonts w:eastAsia="Arial" w:cs="Arial"/>
-        </w:rPr>
-        <w:t>flujos de cada uno de los casos de uso, ademas de un</w:t>
-      </w:r>
-      <w:r>
-        <w:rPr>
-          <w:rFonts w:eastAsia="Arial" w:cs="Arial"/>
-        </w:rPr>
-        <w:t xml:space="preserve"> diagrama elaborado a partir de los casos de uso preliminares del Sistema Administrativo de Tutorías, conseguidos a partir de la entrevista con la Coordinación de Tutorías, el análisis del estado actual del Programa Institucional de Tutorías y el prototipo visual. Este documento se ira actualizando conforme se valla desarrollando el proyecto de acuerdo a sus funciones.</w:t>
+        <w:t>Este documento presenta los flujos de cada uno de los casos de uso, ademas de un diagrama elaborado a partir de los casos de uso preliminares del Sistema Administrativo de Tutorías, conseguidos a partir de la entrevista con la Coordinación de Tutorías, el análisis del estado actual del Programa Institucional de Tutorías y el prototipo visual. Este documento se ira actualizando conforme se valla desarrollando el proyecto de acuerdo a sus funciones.</w:t>
       </w:r>
     </w:p>
     <w:p>
@@ -834,13 +822,7 @@
         <w:rPr>
           <w:rFonts w:eastAsia="Arial" w:cs="Arial"/>
         </w:rPr>
-        <w:t xml:space="preserve">2. Casos de uso </w:t>
-      </w:r>
-      <w:r>
-        <w:rPr>
-          <w:rFonts w:eastAsia="Arial" w:cs="Arial"/>
-        </w:rPr>
-        <w:t>y su flujo</w:t>
+        <w:t>2. Casos de uso y su flujo</w:t>
       </w:r>
     </w:p>
     <w:p>
@@ -1716,25 +1698,6 @@
         <w:pStyle w:val="BodyText"/>
         <w:bidi w:val="0"/>
         <w:spacing w:lineRule="auto" w:line="360"/>
-        <w:jc w:val="both"/>
-        <w:rPr>
-          <w:color w:val="000000"/>
-          <w:u w:val="single"/>
-        </w:rPr>
-      </w:pPr>
-      <w:r>
-        <w:rPr>
-          <w:color w:val="000000"/>
-          <w:u w:val="single"/>
-        </w:rPr>
-        <w:t xml:space="preserve">Bloque 2 - Datos derivados o calculados </w:t>
-      </w:r>
-    </w:p>
-    <w:p>
-      <w:pPr>
-        <w:pStyle w:val="BodyText"/>
-        <w:bidi w:val="0"/>
-        <w:spacing w:lineRule="auto" w:line="360"/>
         <w:ind w:hanging="0" w:start="0" w:end="0"/>
         <w:jc w:val="start"/>
         <w:rPr>
@@ -1750,22 +1713,22 @@
           <w:iCs/>
           <w:color w:val="000000"/>
         </w:rPr>
-        <w:t>CU-07. Identificar estudiantes que requieren atención</w:t>
+        <w:t>CU-13. Consultar disponibilidad de formularios (Estudiante)</w:t>
       </w:r>
       <w:r>
         <w:rPr>
           <w:color w:val="000000"/>
         </w:rPr>
         <w:br/>
-        <w:t>Participantes: Tutor, Interfaz, Motor de reglas, Base de datos</w:t>
-      </w:r>
-    </w:p>
-    <w:p>
-      <w:pPr>
-        <w:pStyle w:val="BodyText"/>
-        <w:numPr>
-          <w:ilvl w:val="0"/>
-          <w:numId w:val="5"/>
+        <w:t>Participantes: Estudiante, Portal estudiantil, Lógica de periodo, Base de datos</w:t>
+      </w:r>
+    </w:p>
+    <w:p>
+      <w:pPr>
+        <w:pStyle w:val="BodyText"/>
+        <w:numPr>
+          <w:ilvl w:val="0"/>
+          <w:numId w:val="13"/>
         </w:numPr>
         <w:tabs>
           <w:tab w:val="clear" w:pos="720"/>
@@ -1783,15 +1746,15 @@
         <w:rPr>
           <w:color w:val="000000"/>
         </w:rPr>
-        <w:t xml:space="preserve">La interfaz pide los estudiantes del tutor. </w:t>
-      </w:r>
-    </w:p>
-    <w:p>
-      <w:pPr>
-        <w:pStyle w:val="BodyText"/>
-        <w:numPr>
-          <w:ilvl w:val="0"/>
-          <w:numId w:val="5"/>
+        <w:t>El estudiante entra al portal estudiantil.</w:t>
+      </w:r>
+    </w:p>
+    <w:p>
+      <w:pPr>
+        <w:pStyle w:val="BodyText"/>
+        <w:numPr>
+          <w:ilvl w:val="0"/>
+          <w:numId w:val="13"/>
         </w:numPr>
         <w:tabs>
           <w:tab w:val="clear" w:pos="720"/>
@@ -1799,25 +1762,25 @@
         </w:tabs>
         <w:bidi w:val="0"/>
         <w:spacing w:lineRule="auto" w:line="360" w:before="0" w:after="0"/>
-        <w:ind w:hanging="283" w:start="709"/>
-        <w:jc w:val="both"/>
-        <w:rPr>
-          <w:color w:val="000000"/>
-        </w:rPr>
-      </w:pPr>
-      <w:r>
-        <w:rPr>
-          <w:color w:val="000000"/>
-        </w:rPr>
-        <w:t xml:space="preserve">Motor de reglas consulta materias reprobadas, diagnóstico y canalizaciones de cada uno. </w:t>
-      </w:r>
-    </w:p>
-    <w:p>
-      <w:pPr>
-        <w:pStyle w:val="BodyText"/>
-        <w:numPr>
-          <w:ilvl w:val="0"/>
-          <w:numId w:val="5"/>
+        <w:ind w:hanging="283" w:start="709" w:end="0"/>
+        <w:jc w:val="both"/>
+        <w:rPr>
+          <w:color w:val="000000"/>
+        </w:rPr>
+      </w:pPr>
+      <w:r>
+        <w:rPr>
+          <w:color w:val="000000"/>
+        </w:rPr>
+        <w:t>La interfaz consulta el periodo de captura vigente.</w:t>
+      </w:r>
+    </w:p>
+    <w:p>
+      <w:pPr>
+        <w:pStyle w:val="BodyText"/>
+        <w:numPr>
+          <w:ilvl w:val="0"/>
+          <w:numId w:val="13"/>
         </w:numPr>
         <w:tabs>
           <w:tab w:val="clear" w:pos="720"/>
@@ -1825,25 +1788,25 @@
         </w:tabs>
         <w:bidi w:val="0"/>
         <w:spacing w:lineRule="auto" w:line="360" w:before="0" w:after="0"/>
-        <w:ind w:hanging="283" w:start="709"/>
-        <w:jc w:val="both"/>
-        <w:rPr>
-          <w:color w:val="000000"/>
-        </w:rPr>
-      </w:pPr>
-      <w:r>
-        <w:rPr>
-          <w:color w:val="000000"/>
-        </w:rPr>
-        <w:t xml:space="preserve">Motor de reglas evalúa los criterios acordados con Coordinación. </w:t>
-      </w:r>
-    </w:p>
-    <w:p>
-      <w:pPr>
-        <w:pStyle w:val="BodyText"/>
-        <w:numPr>
-          <w:ilvl w:val="0"/>
-          <w:numId w:val="5"/>
+        <w:ind w:hanging="283" w:start="709" w:end="0"/>
+        <w:jc w:val="both"/>
+        <w:rPr>
+          <w:color w:val="000000"/>
+        </w:rPr>
+      </w:pPr>
+      <w:r>
+        <w:rPr>
+          <w:color w:val="000000"/>
+        </w:rPr>
+        <w:t>Lógica de periodo compara la fecha actual contra las fechas que configuró Coordinación en Base de datos.</w:t>
+      </w:r>
+    </w:p>
+    <w:p>
+      <w:pPr>
+        <w:pStyle w:val="BodyText"/>
+        <w:numPr>
+          <w:ilvl w:val="0"/>
+          <w:numId w:val="13"/>
         </w:numPr>
         <w:tabs>
           <w:tab w:val="clear" w:pos="720"/>
@@ -1851,25 +1814,25 @@
         </w:tabs>
         <w:bidi w:val="0"/>
         <w:spacing w:lineRule="auto" w:line="360" w:before="0" w:after="0"/>
-        <w:ind w:hanging="283" w:start="709"/>
-        <w:jc w:val="both"/>
-        <w:rPr>
-          <w:color w:val="000000"/>
-        </w:rPr>
-      </w:pPr>
-      <w:r>
-        <w:rPr>
-          <w:color w:val="000000"/>
-        </w:rPr>
-        <w:t xml:space="preserve">Devuelve la situación de cada estudiante (al corriente, requiere atención, canalizado, sin diagnóstico). </w:t>
-      </w:r>
-    </w:p>
-    <w:p>
-      <w:pPr>
-        <w:pStyle w:val="BodyText"/>
-        <w:numPr>
-          <w:ilvl w:val="0"/>
-          <w:numId w:val="5"/>
+        <w:ind w:hanging="283" w:start="709" w:end="0"/>
+        <w:jc w:val="both"/>
+        <w:rPr>
+          <w:color w:val="000000"/>
+        </w:rPr>
+      </w:pPr>
+      <w:r>
+        <w:rPr>
+          <w:color w:val="000000"/>
+        </w:rPr>
+        <w:t>Si el periodo está abierto, Lógica de periodo consulta los formularios activos de ese periodo.</w:t>
+      </w:r>
+    </w:p>
+    <w:p>
+      <w:pPr>
+        <w:pStyle w:val="BodyText"/>
+        <w:numPr>
+          <w:ilvl w:val="0"/>
+          <w:numId w:val="13"/>
         </w:numPr>
         <w:tabs>
           <w:tab w:val="clear" w:pos="720"/>
@@ -1884,26 +1847,50 @@
         </w:rPr>
       </w:pPr>
       <w:r>
-        <w:rPr>
-          <w:color w:val="000000"/>
-        </w:rPr>
-        <w:t xml:space="preserve">La interfaz muestra la lista con sus etiquetas. </w:t>
-      </w:r>
-    </w:p>
-    <w:p>
-      <w:pPr>
-        <w:pStyle w:val="BodyText"/>
+        <w:rPr/>
+        <w:t>La interfaz muestra el estado del periodo y la lista de formularios con su enlace.</w:t>
+        <w:br/>
+        <w:t xml:space="preserve">Alterno: periodo cerrado → la interfaz muestra que no hay formularios disponibles, sin mostrar la lista. </w:t>
+      </w:r>
+    </w:p>
+    <w:p>
+      <w:pPr>
+        <w:pStyle w:val="BodyText"/>
+        <w:numPr>
+          <w:ilvl w:val="0"/>
+          <w:numId w:val="0"/>
+        </w:numPr>
+        <w:tabs>
+          <w:tab w:val="clear" w:pos="720"/>
+          <w:tab w:val="left" w:pos="0" w:leader="none"/>
+        </w:tabs>
         <w:bidi w:val="0"/>
         <w:spacing w:lineRule="auto" w:line="360"/>
-        <w:jc w:val="both"/>
-        <w:rPr>
-          <w:color w:val="000000"/>
-        </w:rPr>
-      </w:pPr>
-      <w:r>
-        <w:rPr>
-          <w:color w:val="000000"/>
-        </w:rPr>
+        <w:ind w:hanging="0" w:start="0"/>
+        <w:jc w:val="both"/>
+        <w:rPr/>
+      </w:pPr>
+      <w:r>
+        <w:rPr/>
+      </w:r>
+    </w:p>
+    <w:p>
+      <w:pPr>
+        <w:pStyle w:val="BodyText"/>
+        <w:bidi w:val="0"/>
+        <w:spacing w:lineRule="auto" w:line="360"/>
+        <w:jc w:val="both"/>
+        <w:rPr>
+          <w:color w:val="000000"/>
+          <w:u w:val="single"/>
+        </w:rPr>
+      </w:pPr>
+      <w:r>
+        <w:rPr>
+          <w:color w:val="000000"/>
+          <w:u w:val="single"/>
+        </w:rPr>
+        <w:t xml:space="preserve">Bloque 2 - Datos derivados o calculados </w:t>
       </w:r>
     </w:p>
     <w:p>
@@ -1926,22 +1913,22 @@
           <w:iCs/>
           <w:color w:val="000000"/>
         </w:rPr>
-        <w:t>CU-06. Consultar el perfil del grupo (diagnóstico)</w:t>
+        <w:t>CU-07. Identificar estudiantes que requieren atención</w:t>
       </w:r>
       <w:r>
         <w:rPr>
           <w:color w:val="000000"/>
         </w:rPr>
         <w:br/>
-        <w:t>Participantes: Tutor, Interfaz, Lógica de diagnóstico, Base de datos</w:t>
-      </w:r>
-    </w:p>
-    <w:p>
-      <w:pPr>
-        <w:pStyle w:val="BodyText"/>
-        <w:numPr>
-          <w:ilvl w:val="0"/>
-          <w:numId w:val="6"/>
+        <w:t>Participantes: Tutor, Interfaz, Motor de reglas, Base de datos</w:t>
+      </w:r>
+    </w:p>
+    <w:p>
+      <w:pPr>
+        <w:pStyle w:val="BodyText"/>
+        <w:numPr>
+          <w:ilvl w:val="0"/>
+          <w:numId w:val="5"/>
         </w:numPr>
         <w:tabs>
           <w:tab w:val="clear" w:pos="720"/>
@@ -1959,15 +1946,15 @@
         <w:rPr>
           <w:color w:val="000000"/>
         </w:rPr>
-        <w:t xml:space="preserve">El tutor abre el perfil del grupo. </w:t>
-      </w:r>
-    </w:p>
-    <w:p>
-      <w:pPr>
-        <w:pStyle w:val="BodyText"/>
-        <w:numPr>
-          <w:ilvl w:val="0"/>
-          <w:numId w:val="6"/>
+        <w:t xml:space="preserve">La interfaz pide los estudiantes del tutor. </w:t>
+      </w:r>
+    </w:p>
+    <w:p>
+      <w:pPr>
+        <w:pStyle w:val="BodyText"/>
+        <w:numPr>
+          <w:ilvl w:val="0"/>
+          <w:numId w:val="5"/>
         </w:numPr>
         <w:tabs>
           <w:tab w:val="clear" w:pos="720"/>
@@ -1985,15 +1972,15 @@
         <w:rPr>
           <w:color w:val="000000"/>
         </w:rPr>
-        <w:t xml:space="preserve">Lógica de diagnóstico consulta las respuestas del grupo en el semestre actual. </w:t>
-      </w:r>
-    </w:p>
-    <w:p>
-      <w:pPr>
-        <w:pStyle w:val="BodyText"/>
-        <w:numPr>
-          <w:ilvl w:val="0"/>
-          <w:numId w:val="6"/>
+        <w:t xml:space="preserve">Motor de reglas consulta materias reprobadas, diagnóstico y canalizaciones de cada uno. </w:t>
+      </w:r>
+    </w:p>
+    <w:p>
+      <w:pPr>
+        <w:pStyle w:val="BodyText"/>
+        <w:numPr>
+          <w:ilvl w:val="0"/>
+          <w:numId w:val="5"/>
         </w:numPr>
         <w:tabs>
           <w:tab w:val="clear" w:pos="720"/>
@@ -2011,15 +1998,41 @@
         <w:rPr>
           <w:color w:val="000000"/>
         </w:rPr>
-        <w:t xml:space="preserve">Calcula la distribución por nivel (técnicas de estudio, motivación) y por estilo de aprendizaje. </w:t>
-      </w:r>
-    </w:p>
-    <w:p>
-      <w:pPr>
-        <w:pStyle w:val="BodyText"/>
-        <w:numPr>
-          <w:ilvl w:val="0"/>
-          <w:numId w:val="6"/>
+        <w:t xml:space="preserve">Motor de reglas evalúa los criterios acordados con Coordinación. </w:t>
+      </w:r>
+    </w:p>
+    <w:p>
+      <w:pPr>
+        <w:pStyle w:val="BodyText"/>
+        <w:numPr>
+          <w:ilvl w:val="0"/>
+          <w:numId w:val="5"/>
+        </w:numPr>
+        <w:tabs>
+          <w:tab w:val="clear" w:pos="720"/>
+          <w:tab w:val="left" w:pos="0" w:leader="none"/>
+        </w:tabs>
+        <w:bidi w:val="0"/>
+        <w:spacing w:lineRule="auto" w:line="360" w:before="0" w:after="0"/>
+        <w:ind w:hanging="283" w:start="709"/>
+        <w:jc w:val="both"/>
+        <w:rPr>
+          <w:color w:val="000000"/>
+        </w:rPr>
+      </w:pPr>
+      <w:r>
+        <w:rPr>
+          <w:color w:val="000000"/>
+        </w:rPr>
+        <w:t xml:space="preserve">Devuelve la situación de cada estudiante (al corriente, requiere atención, canalizado, sin diagnóstico). </w:t>
+      </w:r>
+    </w:p>
+    <w:p>
+      <w:pPr>
+        <w:pStyle w:val="BodyText"/>
+        <w:numPr>
+          <w:ilvl w:val="0"/>
+          <w:numId w:val="5"/>
         </w:numPr>
         <w:tabs>
           <w:tab w:val="clear" w:pos="720"/>
@@ -2037,9 +2050,7 @@
         <w:rPr>
           <w:color w:val="000000"/>
         </w:rPr>
-        <w:t>La interfaz muestra las barras y porcentajes.</w:t>
-        <w:br/>
-        <w:t xml:space="preserve">Alterno: sin resultados de diagnóstico aún → la interfaz indica que no hay datos. </w:t>
+        <w:t xml:space="preserve">La interfaz muestra la lista con sus etiquetas. </w:t>
       </w:r>
     </w:p>
     <w:p>
@@ -2050,15 +2061,12 @@
         <w:jc w:val="both"/>
         <w:rPr>
           <w:color w:val="000000"/>
-          <w:u w:val="single"/>
-        </w:rPr>
-      </w:pPr>
-      <w:r>
-        <w:rPr>
-          <w:color w:val="000000"/>
-          <w:u w:val="single"/>
-        </w:rPr>
-        <w:t>Bloque 3 - Captura con reglas</w:t>
+        </w:rPr>
+      </w:pPr>
+      <w:r>
+        <w:rPr>
+          <w:color w:val="000000"/>
+        </w:rPr>
       </w:r>
     </w:p>
     <w:p>
@@ -2081,22 +2089,22 @@
           <w:iCs/>
           <w:color w:val="000000"/>
         </w:rPr>
-        <w:t>CU-04. Registrar una observación</w:t>
+        <w:t>CU-06. Consultar el perfil del grupo (diagnóstico)</w:t>
       </w:r>
       <w:r>
         <w:rPr>
           <w:color w:val="000000"/>
         </w:rPr>
         <w:br/>
-        <w:t>Participantes: Tutor, Interfaz, Lógica de observaciones, Base de datos</w:t>
-      </w:r>
-    </w:p>
-    <w:p>
-      <w:pPr>
-        <w:pStyle w:val="BodyText"/>
-        <w:numPr>
-          <w:ilvl w:val="0"/>
-          <w:numId w:val="7"/>
+        <w:t>Participantes: Tutor, Interfaz, Lógica de diagnóstico, Base de datos</w:t>
+      </w:r>
+    </w:p>
+    <w:p>
+      <w:pPr>
+        <w:pStyle w:val="BodyText"/>
+        <w:numPr>
+          <w:ilvl w:val="0"/>
+          <w:numId w:val="6"/>
         </w:numPr>
         <w:tabs>
           <w:tab w:val="clear" w:pos="720"/>
@@ -2114,15 +2122,15 @@
         <w:rPr>
           <w:color w:val="000000"/>
         </w:rPr>
-        <w:t xml:space="preserve">El tutor llena etiqueta, texto y marca de privada. </w:t>
-      </w:r>
-    </w:p>
-    <w:p>
-      <w:pPr>
-        <w:pStyle w:val="BodyText"/>
-        <w:numPr>
-          <w:ilvl w:val="0"/>
-          <w:numId w:val="7"/>
+        <w:t xml:space="preserve">El tutor abre el perfil del grupo. </w:t>
+      </w:r>
+    </w:p>
+    <w:p>
+      <w:pPr>
+        <w:pStyle w:val="BodyText"/>
+        <w:numPr>
+          <w:ilvl w:val="0"/>
+          <w:numId w:val="6"/>
         </w:numPr>
         <w:tabs>
           <w:tab w:val="clear" w:pos="720"/>
@@ -2140,15 +2148,15 @@
         <w:rPr>
           <w:color w:val="000000"/>
         </w:rPr>
-        <w:t xml:space="preserve">Al enviar, la interfaz valida que el texto no esté vacío. </w:t>
-      </w:r>
-    </w:p>
-    <w:p>
-      <w:pPr>
-        <w:pStyle w:val="BodyText"/>
-        <w:numPr>
-          <w:ilvl w:val="0"/>
-          <w:numId w:val="7"/>
+        <w:t xml:space="preserve">Lógica de diagnóstico consulta las respuestas del grupo en el semestre actual. </w:t>
+      </w:r>
+    </w:p>
+    <w:p>
+      <w:pPr>
+        <w:pStyle w:val="BodyText"/>
+        <w:numPr>
+          <w:ilvl w:val="0"/>
+          <w:numId w:val="6"/>
         </w:numPr>
         <w:tabs>
           <w:tab w:val="clear" w:pos="720"/>
@@ -2166,41 +2174,15 @@
         <w:rPr>
           <w:color w:val="000000"/>
         </w:rPr>
-        <w:t xml:space="preserve">Lógica de observaciones verifica que el semestre esté abierto. </w:t>
-      </w:r>
-    </w:p>
-    <w:p>
-      <w:pPr>
-        <w:pStyle w:val="BodyText"/>
-        <w:numPr>
-          <w:ilvl w:val="0"/>
-          <w:numId w:val="7"/>
-        </w:numPr>
-        <w:tabs>
-          <w:tab w:val="clear" w:pos="720"/>
-          <w:tab w:val="left" w:pos="0" w:leader="none"/>
-        </w:tabs>
-        <w:bidi w:val="0"/>
-        <w:spacing w:lineRule="auto" w:line="360" w:before="0" w:after="0"/>
-        <w:ind w:hanging="283" w:start="709"/>
-        <w:jc w:val="both"/>
-        <w:rPr>
-          <w:color w:val="000000"/>
-        </w:rPr>
-      </w:pPr>
-      <w:r>
-        <w:rPr>
-          <w:color w:val="000000"/>
-        </w:rPr>
-        <w:t xml:space="preserve">Si está abierto, guarda la observación con fecha y autor. </w:t>
-      </w:r>
-    </w:p>
-    <w:p>
-      <w:pPr>
-        <w:pStyle w:val="BodyText"/>
-        <w:numPr>
-          <w:ilvl w:val="0"/>
-          <w:numId w:val="7"/>
+        <w:t xml:space="preserve">Calcula la distribución por nivel (técnicas de estudio, motivación) y por estilo de aprendizaje. </w:t>
+      </w:r>
+    </w:p>
+    <w:p>
+      <w:pPr>
+        <w:pStyle w:val="BodyText"/>
+        <w:numPr>
+          <w:ilvl w:val="0"/>
+          <w:numId w:val="6"/>
         </w:numPr>
         <w:tabs>
           <w:tab w:val="clear" w:pos="720"/>
@@ -2218,9 +2200,9 @@
         <w:rPr>
           <w:color w:val="000000"/>
         </w:rPr>
-        <w:t>La interfaz la agrega a la lista del semestre actual.</w:t>
+        <w:t>La interfaz muestra las barras y porcentajes.</w:t>
         <w:br/>
-        <w:t xml:space="preserve">Alterno: semestre cerrado → se rechaza el guardado. </w:t>
+        <w:t xml:space="preserve">Alterno: sin resultados de diagnóstico aún → la interfaz indica que no hay datos. </w:t>
       </w:r>
     </w:p>
     <w:p>
@@ -2231,12 +2213,15 @@
         <w:jc w:val="both"/>
         <w:rPr>
           <w:color w:val="000000"/>
-        </w:rPr>
-      </w:pPr>
-      <w:r>
-        <w:rPr>
-          <w:color w:val="000000"/>
-        </w:rPr>
+          <w:u w:val="single"/>
+        </w:rPr>
+      </w:pPr>
+      <w:r>
+        <w:rPr>
+          <w:color w:val="000000"/>
+          <w:u w:val="single"/>
+        </w:rPr>
+        <w:t>Bloque 3 - Captura con reglas</w:t>
       </w:r>
     </w:p>
     <w:p>
@@ -2259,22 +2244,22 @@
           <w:iCs/>
           <w:color w:val="000000"/>
         </w:rPr>
-        <w:t>CU-05. Consultar expedientes de semestres anteriores</w:t>
+        <w:t>CU-04. Registrar una observación</w:t>
       </w:r>
       <w:r>
         <w:rPr>
           <w:color w:val="000000"/>
         </w:rPr>
         <w:br/>
-        <w:t>Participantes: Tutor, Interfaz, Lógica de historial, Base de datos</w:t>
-      </w:r>
-    </w:p>
-    <w:p>
-      <w:pPr>
-        <w:pStyle w:val="BodyText"/>
-        <w:numPr>
-          <w:ilvl w:val="0"/>
-          <w:numId w:val="8"/>
+        <w:t>Participantes: Tutor, Interfaz, Lógica de observaciones, Base de datos</w:t>
+      </w:r>
+    </w:p>
+    <w:p>
+      <w:pPr>
+        <w:pStyle w:val="BodyText"/>
+        <w:numPr>
+          <w:ilvl w:val="0"/>
+          <w:numId w:val="7"/>
         </w:numPr>
         <w:tabs>
           <w:tab w:val="clear" w:pos="720"/>
@@ -2292,15 +2277,15 @@
         <w:rPr>
           <w:color w:val="000000"/>
         </w:rPr>
-        <w:t xml:space="preserve">El tutor abre un semestre anterior. </w:t>
-      </w:r>
-    </w:p>
-    <w:p>
-      <w:pPr>
-        <w:pStyle w:val="BodyText"/>
-        <w:numPr>
-          <w:ilvl w:val="0"/>
-          <w:numId w:val="8"/>
+        <w:t xml:space="preserve">El tutor llena etiqueta, texto y marca de privada. </w:t>
+      </w:r>
+    </w:p>
+    <w:p>
+      <w:pPr>
+        <w:pStyle w:val="BodyText"/>
+        <w:numPr>
+          <w:ilvl w:val="0"/>
+          <w:numId w:val="7"/>
         </w:numPr>
         <w:tabs>
           <w:tab w:val="clear" w:pos="720"/>
@@ -2318,15 +2303,15 @@
         <w:rPr>
           <w:color w:val="000000"/>
         </w:rPr>
-        <w:t xml:space="preserve">Lógica de historial consulta los registros de ese periodo, marcados como cerrados. </w:t>
-      </w:r>
-    </w:p>
-    <w:p>
-      <w:pPr>
-        <w:pStyle w:val="BodyText"/>
-        <w:numPr>
-          <w:ilvl w:val="0"/>
-          <w:numId w:val="8"/>
+        <w:t xml:space="preserve">Al enviar, la interfaz valida que el texto no esté vacío. </w:t>
+      </w:r>
+    </w:p>
+    <w:p>
+      <w:pPr>
+        <w:pStyle w:val="BodyText"/>
+        <w:numPr>
+          <w:ilvl w:val="0"/>
+          <w:numId w:val="7"/>
         </w:numPr>
         <w:tabs>
           <w:tab w:val="clear" w:pos="720"/>
@@ -2344,15 +2329,41 @@
         <w:rPr>
           <w:color w:val="000000"/>
         </w:rPr>
-        <w:t xml:space="preserve">Base de datos los devuelve. </w:t>
-      </w:r>
-    </w:p>
-    <w:p>
-      <w:pPr>
-        <w:pStyle w:val="BodyText"/>
-        <w:numPr>
-          <w:ilvl w:val="0"/>
-          <w:numId w:val="8"/>
+        <w:t xml:space="preserve">Lógica de observaciones verifica que el semestre esté abierto. </w:t>
+      </w:r>
+    </w:p>
+    <w:p>
+      <w:pPr>
+        <w:pStyle w:val="BodyText"/>
+        <w:numPr>
+          <w:ilvl w:val="0"/>
+          <w:numId w:val="7"/>
+        </w:numPr>
+        <w:tabs>
+          <w:tab w:val="clear" w:pos="720"/>
+          <w:tab w:val="left" w:pos="0" w:leader="none"/>
+        </w:tabs>
+        <w:bidi w:val="0"/>
+        <w:spacing w:lineRule="auto" w:line="360" w:before="0" w:after="0"/>
+        <w:ind w:hanging="283" w:start="709"/>
+        <w:jc w:val="both"/>
+        <w:rPr>
+          <w:color w:val="000000"/>
+        </w:rPr>
+      </w:pPr>
+      <w:r>
+        <w:rPr>
+          <w:color w:val="000000"/>
+        </w:rPr>
+        <w:t xml:space="preserve">Si está abierto, guarda la observación con fecha y autor. </w:t>
+      </w:r>
+    </w:p>
+    <w:p>
+      <w:pPr>
+        <w:pStyle w:val="BodyText"/>
+        <w:numPr>
+          <w:ilvl w:val="0"/>
+          <w:numId w:val="7"/>
         </w:numPr>
         <w:tabs>
           <w:tab w:val="clear" w:pos="720"/>
@@ -2370,7 +2381,9 @@
         <w:rPr>
           <w:color w:val="000000"/>
         </w:rPr>
-        <w:t xml:space="preserve">La interfaz los muestra en modo solo lectura, sin formulario de captura. </w:t>
+        <w:t>La interfaz la agrega a la lista del semestre actual.</w:t>
+        <w:br/>
+        <w:t xml:space="preserve">Alterno: semestre cerrado → se rechaza el guardado. </w:t>
       </w:r>
     </w:p>
     <w:p>
@@ -2408,24 +2421,23 @@
           <w:i/>
           <w:iCs/>
           <w:color w:val="000000"/>
-          <w:u w:val="none"/>
-        </w:rPr>
-        <w:t>CU-09. Registrar una canalización</w:t>
+        </w:rPr>
+        <w:t>CU-05. Consultar expedientes de semestres anteriores</w:t>
       </w:r>
       <w:r>
         <w:rPr>
           <w:color w:val="000000"/>
         </w:rPr>
         <w:br/>
-        <w:t>Participantes: Tutor, Interfaz, Lógica de canalización, Base de datos, Coordinación</w:t>
-      </w:r>
-    </w:p>
-    <w:p>
-      <w:pPr>
-        <w:pStyle w:val="BodyText"/>
-        <w:numPr>
-          <w:ilvl w:val="0"/>
-          <w:numId w:val="9"/>
+        <w:t>Participantes: Tutor, Interfaz, Lógica de historial, Base de datos</w:t>
+      </w:r>
+    </w:p>
+    <w:p>
+      <w:pPr>
+        <w:pStyle w:val="BodyText"/>
+        <w:numPr>
+          <w:ilvl w:val="0"/>
+          <w:numId w:val="8"/>
         </w:numPr>
         <w:tabs>
           <w:tab w:val="clear" w:pos="720"/>
@@ -2443,15 +2455,15 @@
         <w:rPr>
           <w:color w:val="000000"/>
         </w:rPr>
-        <w:t xml:space="preserve">El tutor llena el formulario: estudiante, motivo, a quién refiere. </w:t>
-      </w:r>
-    </w:p>
-    <w:p>
-      <w:pPr>
-        <w:pStyle w:val="BodyText"/>
-        <w:numPr>
-          <w:ilvl w:val="0"/>
-          <w:numId w:val="9"/>
+        <w:t xml:space="preserve">El tutor abre un semestre anterior. </w:t>
+      </w:r>
+    </w:p>
+    <w:p>
+      <w:pPr>
+        <w:pStyle w:val="BodyText"/>
+        <w:numPr>
+          <w:ilvl w:val="0"/>
+          <w:numId w:val="8"/>
         </w:numPr>
         <w:tabs>
           <w:tab w:val="clear" w:pos="720"/>
@@ -2469,15 +2481,15 @@
         <w:rPr>
           <w:color w:val="000000"/>
         </w:rPr>
-        <w:t xml:space="preserve">La interfaz valida los campos obligatorios. </w:t>
-      </w:r>
-    </w:p>
-    <w:p>
-      <w:pPr>
-        <w:pStyle w:val="BodyText"/>
-        <w:numPr>
-          <w:ilvl w:val="0"/>
-          <w:numId w:val="9"/>
+        <w:t xml:space="preserve">Lógica de historial consulta los registros de ese periodo, marcados como cerrados. </w:t>
+      </w:r>
+    </w:p>
+    <w:p>
+      <w:pPr>
+        <w:pStyle w:val="BodyText"/>
+        <w:numPr>
+          <w:ilvl w:val="0"/>
+          <w:numId w:val="8"/>
         </w:numPr>
         <w:tabs>
           <w:tab w:val="clear" w:pos="720"/>
@@ -2495,41 +2507,15 @@
         <w:rPr>
           <w:color w:val="000000"/>
         </w:rPr>
-        <w:t xml:space="preserve">Lógica de canalización guarda el registro con estado "pendiente". </w:t>
-      </w:r>
-    </w:p>
-    <w:p>
-      <w:pPr>
-        <w:pStyle w:val="BodyText"/>
-        <w:numPr>
-          <w:ilvl w:val="0"/>
-          <w:numId w:val="9"/>
-        </w:numPr>
-        <w:tabs>
-          <w:tab w:val="clear" w:pos="720"/>
-          <w:tab w:val="left" w:pos="0" w:leader="none"/>
-        </w:tabs>
-        <w:bidi w:val="0"/>
-        <w:spacing w:lineRule="auto" w:line="360" w:before="0" w:after="0"/>
-        <w:ind w:hanging="283" w:start="709"/>
-        <w:jc w:val="both"/>
-        <w:rPr>
-          <w:color w:val="000000"/>
-        </w:rPr>
-      </w:pPr>
-      <w:r>
-        <w:rPr>
-          <w:color w:val="000000"/>
-        </w:rPr>
-        <w:t xml:space="preserve">Notifica (o queda visible) para Coordinación. </w:t>
-      </w:r>
-    </w:p>
-    <w:p>
-      <w:pPr>
-        <w:pStyle w:val="BodyText"/>
-        <w:numPr>
-          <w:ilvl w:val="0"/>
-          <w:numId w:val="9"/>
+        <w:t xml:space="preserve">Base de datos los devuelve. </w:t>
+      </w:r>
+    </w:p>
+    <w:p>
+      <w:pPr>
+        <w:pStyle w:val="BodyText"/>
+        <w:numPr>
+          <w:ilvl w:val="0"/>
+          <w:numId w:val="8"/>
         </w:numPr>
         <w:tabs>
           <w:tab w:val="clear" w:pos="720"/>
@@ -2547,9 +2533,7 @@
         <w:rPr>
           <w:color w:val="000000"/>
         </w:rPr>
-        <w:t>Coordinación consulta la canalización y actualiza su estado (agendada, atendida).</w:t>
-        <w:br/>
-        <w:t xml:space="preserve">Alterno: faltan datos obligatorios → se marcan los campos y no se guarda. </w:t>
+        <w:t xml:space="preserve">La interfaz los muestra en modo solo lectura, sin formulario de captura. </w:t>
       </w:r>
     </w:p>
     <w:p>
@@ -2566,25 +2550,6 @@
         <w:rPr>
           <w:color w:val="000000"/>
         </w:rPr>
-      </w:r>
-    </w:p>
-    <w:p>
-      <w:pPr>
-        <w:pStyle w:val="BodyText"/>
-        <w:bidi w:val="0"/>
-        <w:spacing w:lineRule="auto" w:line="360"/>
-        <w:jc w:val="both"/>
-        <w:rPr>
-          <w:color w:val="000000"/>
-          <w:u w:val="single"/>
-        </w:rPr>
-      </w:pPr>
-      <w:r>
-        <w:rPr>
-          <w:color w:val="000000"/>
-          <w:u w:val="single"/>
-        </w:rPr>
-        <w:t>Bloque 4 – Procesos de Coordinación</w:t>
       </w:r>
     </w:p>
     <w:p>
@@ -2606,23 +2571,24 @@
           <w:i/>
           <w:iCs/>
           <w:color w:val="000000"/>
-        </w:rPr>
-        <w:t>CU-10. Asignar tutores y transferir expedientes</w:t>
+          <w:u w:val="none"/>
+        </w:rPr>
+        <w:t>CU-09. Registrar una canalización</w:t>
       </w:r>
       <w:r>
         <w:rPr>
           <w:color w:val="000000"/>
         </w:rPr>
         <w:br/>
-        <w:t>Participantes: Coordinación, Interfaz, Lógica de asignación, Base de datos</w:t>
-      </w:r>
-    </w:p>
-    <w:p>
-      <w:pPr>
-        <w:pStyle w:val="BodyText"/>
-        <w:numPr>
-          <w:ilvl w:val="0"/>
-          <w:numId w:val="10"/>
+        <w:t>Participantes: Tutor, Interfaz, Lógica de canalización, Base de datos, Coordinación</w:t>
+      </w:r>
+    </w:p>
+    <w:p>
+      <w:pPr>
+        <w:pStyle w:val="BodyText"/>
+        <w:numPr>
+          <w:ilvl w:val="0"/>
+          <w:numId w:val="9"/>
         </w:numPr>
         <w:tabs>
           <w:tab w:val="clear" w:pos="720"/>
@@ -2640,15 +2606,15 @@
         <w:rPr>
           <w:color w:val="000000"/>
         </w:rPr>
-        <w:t xml:space="preserve">Coordinación abre la asignación de grupos del nuevo semestre. </w:t>
-      </w:r>
-    </w:p>
-    <w:p>
-      <w:pPr>
-        <w:pStyle w:val="BodyText"/>
-        <w:numPr>
-          <w:ilvl w:val="0"/>
-          <w:numId w:val="10"/>
+        <w:t xml:space="preserve">El tutor llena el formulario: estudiante, motivo, a quién refiere. </w:t>
+      </w:r>
+    </w:p>
+    <w:p>
+      <w:pPr>
+        <w:pStyle w:val="BodyText"/>
+        <w:numPr>
+          <w:ilvl w:val="0"/>
+          <w:numId w:val="9"/>
         </w:numPr>
         <w:tabs>
           <w:tab w:val="clear" w:pos="720"/>
@@ -2666,15 +2632,15 @@
         <w:rPr>
           <w:color w:val="000000"/>
         </w:rPr>
-        <w:t xml:space="preserve">Elige un grupo y un tutor. </w:t>
-      </w:r>
-    </w:p>
-    <w:p>
-      <w:pPr>
-        <w:pStyle w:val="BodyText"/>
-        <w:numPr>
-          <w:ilvl w:val="0"/>
-          <w:numId w:val="10"/>
+        <w:t xml:space="preserve">La interfaz valida los campos obligatorios. </w:t>
+      </w:r>
+    </w:p>
+    <w:p>
+      <w:pPr>
+        <w:pStyle w:val="BodyText"/>
+        <w:numPr>
+          <w:ilvl w:val="0"/>
+          <w:numId w:val="9"/>
         </w:numPr>
         <w:tabs>
           <w:tab w:val="clear" w:pos="720"/>
@@ -2692,15 +2658,15 @@
         <w:rPr>
           <w:color w:val="000000"/>
         </w:rPr>
-        <w:t xml:space="preserve">Lógica de asignación verifica que el grupo no tenga ya tutor asignado ese semestre. </w:t>
-      </w:r>
-    </w:p>
-    <w:p>
-      <w:pPr>
-        <w:pStyle w:val="BodyText"/>
-        <w:numPr>
-          <w:ilvl w:val="0"/>
-          <w:numId w:val="10"/>
+        <w:t xml:space="preserve">Lógica de canalización guarda el registro con estado "pendiente". </w:t>
+      </w:r>
+    </w:p>
+    <w:p>
+      <w:pPr>
+        <w:pStyle w:val="BodyText"/>
+        <w:numPr>
+          <w:ilvl w:val="0"/>
+          <w:numId w:val="9"/>
         </w:numPr>
         <w:tabs>
           <w:tab w:val="clear" w:pos="720"/>
@@ -2718,15 +2684,15 @@
         <w:rPr>
           <w:color w:val="000000"/>
         </w:rPr>
-        <w:t xml:space="preserve">Guarda la asignación tutor-grupo-semestre. </w:t>
-      </w:r>
-    </w:p>
-    <w:p>
-      <w:pPr>
-        <w:pStyle w:val="BodyText"/>
-        <w:numPr>
-          <w:ilvl w:val="0"/>
-          <w:numId w:val="10"/>
+        <w:t xml:space="preserve">Notifica (o queda visible) para Coordinación. </w:t>
+      </w:r>
+    </w:p>
+    <w:p>
+      <w:pPr>
+        <w:pStyle w:val="BodyText"/>
+        <w:numPr>
+          <w:ilvl w:val="0"/>
+          <w:numId w:val="9"/>
         </w:numPr>
         <w:tabs>
           <w:tab w:val="clear" w:pos="720"/>
@@ -2744,7 +2710,9 @@
         <w:rPr>
           <w:color w:val="000000"/>
         </w:rPr>
-        <w:t xml:space="preserve">A partir de ahí, el nuevo tutor consulta el historial sin que los datos se dupliquen (referencia, no copia). </w:t>
+        <w:t>Coordinación consulta la canalización y actualiza su estado (agendada, atendida).</w:t>
+        <w:br/>
+        <w:t xml:space="preserve">Alterno: faltan datos obligatorios → se marcan los campos y no se guarda. </w:t>
       </w:r>
     </w:p>
     <w:p>
@@ -2761,6 +2729,25 @@
         <w:rPr>
           <w:color w:val="000000"/>
         </w:rPr>
+      </w:r>
+    </w:p>
+    <w:p>
+      <w:pPr>
+        <w:pStyle w:val="BodyText"/>
+        <w:bidi w:val="0"/>
+        <w:spacing w:lineRule="auto" w:line="360"/>
+        <w:jc w:val="both"/>
+        <w:rPr>
+          <w:color w:val="000000"/>
+          <w:u w:val="single"/>
+        </w:rPr>
+      </w:pPr>
+      <w:r>
+        <w:rPr>
+          <w:color w:val="000000"/>
+          <w:u w:val="single"/>
+        </w:rPr>
+        <w:t>Bloque 4 – Procesos de Coordinación</w:t>
       </w:r>
     </w:p>
     <w:p>
@@ -2783,22 +2770,22 @@
           <w:iCs/>
           <w:color w:val="000000"/>
         </w:rPr>
-        <w:t>CU-11. Cerrar el semestre</w:t>
+        <w:t>CU-10. Asignar tutores y transferir expedientes</w:t>
       </w:r>
       <w:r>
         <w:rPr>
           <w:color w:val="000000"/>
         </w:rPr>
         <w:br/>
-        <w:t>Participantes: Coordinación, Interfaz, Lógica de cierre, Base de datos</w:t>
-      </w:r>
-    </w:p>
-    <w:p>
-      <w:pPr>
-        <w:pStyle w:val="BodyText"/>
-        <w:numPr>
-          <w:ilvl w:val="0"/>
-          <w:numId w:val="11"/>
+        <w:t>Participantes: Coordinación, Interfaz, Lógica de asignación, Base de datos</w:t>
+      </w:r>
+    </w:p>
+    <w:p>
+      <w:pPr>
+        <w:pStyle w:val="BodyText"/>
+        <w:numPr>
+          <w:ilvl w:val="0"/>
+          <w:numId w:val="10"/>
         </w:numPr>
         <w:tabs>
           <w:tab w:val="clear" w:pos="720"/>
@@ -2816,15 +2803,15 @@
         <w:rPr>
           <w:color w:val="000000"/>
         </w:rPr>
-        <w:t xml:space="preserve">Coordinación elige cerrar el semestre actual. </w:t>
-      </w:r>
-    </w:p>
-    <w:p>
-      <w:pPr>
-        <w:pStyle w:val="BodyText"/>
-        <w:numPr>
-          <w:ilvl w:val="0"/>
-          <w:numId w:val="11"/>
+        <w:t xml:space="preserve">Coordinación abre la asignación de grupos del nuevo semestre. </w:t>
+      </w:r>
+    </w:p>
+    <w:p>
+      <w:pPr>
+        <w:pStyle w:val="BodyText"/>
+        <w:numPr>
+          <w:ilvl w:val="0"/>
+          <w:numId w:val="10"/>
         </w:numPr>
         <w:tabs>
           <w:tab w:val="clear" w:pos="720"/>
@@ -2842,15 +2829,15 @@
         <w:rPr>
           <w:color w:val="000000"/>
         </w:rPr>
-        <w:t xml:space="preserve">La interfaz pide confirmación. </w:t>
-      </w:r>
-    </w:p>
-    <w:p>
-      <w:pPr>
-        <w:pStyle w:val="BodyText"/>
-        <w:numPr>
-          <w:ilvl w:val="0"/>
-          <w:numId w:val="11"/>
+        <w:t xml:space="preserve">Elige un grupo y un tutor. </w:t>
+      </w:r>
+    </w:p>
+    <w:p>
+      <w:pPr>
+        <w:pStyle w:val="BodyText"/>
+        <w:numPr>
+          <w:ilvl w:val="0"/>
+          <w:numId w:val="10"/>
         </w:numPr>
         <w:tabs>
           <w:tab w:val="clear" w:pos="720"/>
@@ -2868,15 +2855,15 @@
         <w:rPr>
           <w:color w:val="000000"/>
         </w:rPr>
-        <w:t xml:space="preserve">Lógica de cierre marca como "cerrado" todos los registros de ese semestre (observaciones, diagnóstico, etc.). </w:t>
-      </w:r>
-    </w:p>
-    <w:p>
-      <w:pPr>
-        <w:pStyle w:val="BodyText"/>
-        <w:numPr>
-          <w:ilvl w:val="0"/>
-          <w:numId w:val="11"/>
+        <w:t xml:space="preserve">Lógica de asignación verifica que el grupo no tenga ya tutor asignado ese semestre. </w:t>
+      </w:r>
+    </w:p>
+    <w:p>
+      <w:pPr>
+        <w:pStyle w:val="BodyText"/>
+        <w:numPr>
+          <w:ilvl w:val="0"/>
+          <w:numId w:val="10"/>
         </w:numPr>
         <w:tabs>
           <w:tab w:val="clear" w:pos="720"/>
@@ -2894,15 +2881,15 @@
         <w:rPr>
           <w:color w:val="000000"/>
         </w:rPr>
-        <w:t xml:space="preserve">Crea el expediente del siguiente semestre para cada estudiante activo. </w:t>
-      </w:r>
-    </w:p>
-    <w:p>
-      <w:pPr>
-        <w:pStyle w:val="BodyText"/>
-        <w:numPr>
-          <w:ilvl w:val="0"/>
-          <w:numId w:val="11"/>
+        <w:t xml:space="preserve">Guarda la asignación tutor-grupo-semestre. </w:t>
+      </w:r>
+    </w:p>
+    <w:p>
+      <w:pPr>
+        <w:pStyle w:val="BodyText"/>
+        <w:numPr>
+          <w:ilvl w:val="0"/>
+          <w:numId w:val="10"/>
         </w:numPr>
         <w:tabs>
           <w:tab w:val="clear" w:pos="720"/>
@@ -2920,9 +2907,7 @@
         <w:rPr>
           <w:color w:val="000000"/>
         </w:rPr>
-        <w:t>Registra quién hizo el cierre y cuándo.</w:t>
-        <w:br/>
-        <w:t xml:space="preserve">Alterno: Coordinación cancela en la confirmación → no pasa nada. </w:t>
+        <w:t xml:space="preserve">A partir de ahí, el nuevo tutor consulta el historial sin que los datos se dupliquen (referencia, no copia). </w:t>
       </w:r>
     </w:p>
     <w:p>
@@ -2961,6 +2946,184 @@
           <w:iCs/>
           <w:color w:val="000000"/>
         </w:rPr>
+        <w:t>CU-11. Cerrar el semestre</w:t>
+      </w:r>
+      <w:r>
+        <w:rPr>
+          <w:color w:val="000000"/>
+        </w:rPr>
+        <w:br/>
+        <w:t>Participantes: Coordinación, Interfaz, Lógica de cierre, Base de datos</w:t>
+      </w:r>
+    </w:p>
+    <w:p>
+      <w:pPr>
+        <w:pStyle w:val="BodyText"/>
+        <w:numPr>
+          <w:ilvl w:val="0"/>
+          <w:numId w:val="11"/>
+        </w:numPr>
+        <w:tabs>
+          <w:tab w:val="clear" w:pos="720"/>
+          <w:tab w:val="left" w:pos="0" w:leader="none"/>
+        </w:tabs>
+        <w:bidi w:val="0"/>
+        <w:spacing w:lineRule="auto" w:line="360" w:before="0" w:after="0"/>
+        <w:ind w:hanging="283" w:start="709" w:end="0"/>
+        <w:jc w:val="both"/>
+        <w:rPr>
+          <w:color w:val="000000"/>
+        </w:rPr>
+      </w:pPr>
+      <w:r>
+        <w:rPr>
+          <w:color w:val="000000"/>
+        </w:rPr>
+        <w:t xml:space="preserve">Coordinación elige cerrar el semestre actual. </w:t>
+      </w:r>
+    </w:p>
+    <w:p>
+      <w:pPr>
+        <w:pStyle w:val="BodyText"/>
+        <w:numPr>
+          <w:ilvl w:val="0"/>
+          <w:numId w:val="11"/>
+        </w:numPr>
+        <w:tabs>
+          <w:tab w:val="clear" w:pos="720"/>
+          <w:tab w:val="left" w:pos="0" w:leader="none"/>
+        </w:tabs>
+        <w:bidi w:val="0"/>
+        <w:spacing w:lineRule="auto" w:line="360" w:before="0" w:after="0"/>
+        <w:ind w:hanging="283" w:start="709"/>
+        <w:jc w:val="both"/>
+        <w:rPr>
+          <w:color w:val="000000"/>
+        </w:rPr>
+      </w:pPr>
+      <w:r>
+        <w:rPr>
+          <w:color w:val="000000"/>
+        </w:rPr>
+        <w:t xml:space="preserve">La interfaz pide confirmación. </w:t>
+      </w:r>
+    </w:p>
+    <w:p>
+      <w:pPr>
+        <w:pStyle w:val="BodyText"/>
+        <w:numPr>
+          <w:ilvl w:val="0"/>
+          <w:numId w:val="11"/>
+        </w:numPr>
+        <w:tabs>
+          <w:tab w:val="clear" w:pos="720"/>
+          <w:tab w:val="left" w:pos="0" w:leader="none"/>
+        </w:tabs>
+        <w:bidi w:val="0"/>
+        <w:spacing w:lineRule="auto" w:line="360" w:before="0" w:after="0"/>
+        <w:ind w:hanging="283" w:start="709"/>
+        <w:jc w:val="both"/>
+        <w:rPr>
+          <w:color w:val="000000"/>
+        </w:rPr>
+      </w:pPr>
+      <w:r>
+        <w:rPr>
+          <w:color w:val="000000"/>
+        </w:rPr>
+        <w:t xml:space="preserve">Lógica de cierre marca como "cerrado" todos los registros de ese semestre (observaciones, diagnóstico, etc.). </w:t>
+      </w:r>
+    </w:p>
+    <w:p>
+      <w:pPr>
+        <w:pStyle w:val="BodyText"/>
+        <w:numPr>
+          <w:ilvl w:val="0"/>
+          <w:numId w:val="11"/>
+        </w:numPr>
+        <w:tabs>
+          <w:tab w:val="clear" w:pos="720"/>
+          <w:tab w:val="left" w:pos="0" w:leader="none"/>
+        </w:tabs>
+        <w:bidi w:val="0"/>
+        <w:spacing w:lineRule="auto" w:line="360" w:before="0" w:after="0"/>
+        <w:ind w:hanging="283" w:start="709"/>
+        <w:jc w:val="both"/>
+        <w:rPr>
+          <w:color w:val="000000"/>
+        </w:rPr>
+      </w:pPr>
+      <w:r>
+        <w:rPr>
+          <w:color w:val="000000"/>
+        </w:rPr>
+        <w:t xml:space="preserve">Crea el expediente del siguiente semestre para cada estudiante activo. </w:t>
+      </w:r>
+    </w:p>
+    <w:p>
+      <w:pPr>
+        <w:pStyle w:val="BodyText"/>
+        <w:numPr>
+          <w:ilvl w:val="0"/>
+          <w:numId w:val="11"/>
+        </w:numPr>
+        <w:tabs>
+          <w:tab w:val="clear" w:pos="720"/>
+          <w:tab w:val="left" w:pos="0" w:leader="none"/>
+        </w:tabs>
+        <w:bidi w:val="0"/>
+        <w:spacing w:lineRule="auto" w:line="360"/>
+        <w:ind w:hanging="283" w:start="709"/>
+        <w:jc w:val="both"/>
+        <w:rPr>
+          <w:color w:val="000000"/>
+        </w:rPr>
+      </w:pPr>
+      <w:r>
+        <w:rPr>
+          <w:color w:val="000000"/>
+        </w:rPr>
+        <w:t>Registra quién hizo el cierre y cuándo.</w:t>
+        <w:br/>
+        <w:t xml:space="preserve">Alterno: Coordinación cancela en la confirmación → no pasa nada. </w:t>
+      </w:r>
+    </w:p>
+    <w:p>
+      <w:pPr>
+        <w:pStyle w:val="BodyText"/>
+        <w:bidi w:val="0"/>
+        <w:spacing w:lineRule="auto" w:line="360"/>
+        <w:jc w:val="both"/>
+        <w:rPr>
+          <w:color w:val="000000"/>
+        </w:rPr>
+      </w:pPr>
+      <w:r>
+        <w:rPr>
+          <w:color w:val="000000"/>
+        </w:rPr>
+      </w:r>
+    </w:p>
+    <w:p>
+      <w:pPr>
+        <w:pStyle w:val="BodyText"/>
+        <w:bidi w:val="0"/>
+        <w:spacing w:lineRule="auto" w:line="360"/>
+        <w:ind w:hanging="0" w:start="0" w:end="0"/>
+        <w:jc w:val="start"/>
+        <w:rPr>
+          <w:color w:val="000000"/>
+        </w:rPr>
+      </w:pPr>
+      <w:r>
+        <w:rPr>
+          <w:rStyle w:val="Strong"/>
+          <w:b w:val="false"/>
+          <w:bCs w:val="false"/>
+          <w:i/>
+          <w:iCs/>
+          <w:color w:val="000000"/>
+        </w:rPr>
         <w:t>CU-12. Registrar resultados del diagnóstico (importación)</w:t>
       </w:r>
       <w:r>
@@ -3116,18 +3279,9 @@
         <w:rPr>
           <w:rFonts w:eastAsia="Arial" w:cs="Arial"/>
         </w:rPr>
-        <w:t>3</w:t>
-      </w:r>
-      <w:r>
-        <w:rPr>
-          <w:rFonts w:eastAsia="Arial" w:cs="Arial"/>
-        </w:rPr>
-        <w:t xml:space="preserve">. </w:t>
-      </w:r>
-      <w:r>
-        <w:rPr>
-          <w:rFonts w:eastAsia="Arial" w:cs="Arial"/>
-        </w:rPr>
+        <w:t xml:space="preserve">3. </w:t>
+      </w:r>
+      <w:r>
         <w:drawing>
           <wp:anchor distT="0" distB="0" distL="0" distR="0" simplePos="0" relativeHeight="6" behindDoc="0" locked="0" layoutInCell="0" allowOverlap="1">
             <wp:simplePos x="0" y="0"/>
@@ -3155,7 +3309,7 @@
                   </pic:nvPicPr>
                   <pic:blipFill>
                     <a:blip r:embed="rId4"/>
-                    <a:srcRect l="6596" t="4171" r="2923" b="2634"/>
+                    <a:srcRect l="6596" t="4172" r="2924" b="2636"/>
                     <a:stretch>
                       <a:fillRect/>
                     </a:stretch>
@@ -3194,39 +3348,7 @@
       </w:pPr>
       <w:r>
         <w:rPr/>
-        <w:t xml:space="preserve">El diagrama </w:t>
-      </w:r>
-      <w:r>
-        <w:rPr/>
-        <w:t xml:space="preserve">siguiente </w:t>
-      </w:r>
-      <w:r>
-        <w:rPr/>
-        <w:t xml:space="preserve">muestra los doce casos de uso dentro del Sistema Administrativo de Tutorías, con el Tutor </w:t>
-      </w:r>
-      <w:r>
-        <w:rPr/>
-        <w:t>(azul)</w:t>
-      </w:r>
-      <w:r>
-        <w:rPr/>
-        <w:t xml:space="preserve"> y la Coordinación </w:t>
-      </w:r>
-      <w:r>
-        <w:rPr/>
-        <w:t>(rojo)</w:t>
-      </w:r>
-      <w:r>
-        <w:rPr/>
-        <w:t xml:space="preserve"> como actores principales </w:t>
-      </w:r>
-      <w:r>
-        <w:rPr/>
-        <w:t>(verde actuando como ambos)</w:t>
-      </w:r>
-      <w:r>
-        <w:rPr/>
-        <w:t>, y Microsoft Forms como actor externo.</w:t>
+        <w:t>El diagrama siguiente muestra los doce casos de uso dentro del Sistema Administrativo de Tutorías, con el Tutor (azul) y la Coordinación (rojo) como actores principales (verde actuando como ambos), y Microsoft Forms como actor externo.</w:t>
       </w:r>
     </w:p>
     <w:sectPr>
@@ -3294,7 +3416,7 @@
     </w:r>
     <w:r>
       <w:rPr/>
-      <w:t>5</w:t>
+      <w:t>8</w:t>
     </w:r>
     <w:r>
       <w:rPr/>
@@ -3323,7 +3445,7 @@
     </w:r>
     <w:r>
       <w:rPr/>
-      <w:t>7</w:t>
+      <w:t>8</w:t>
     </w:r>
     <w:r>
       <w:rPr/>
@@ -4832,6 +4954,125 @@
     </w:lvl>
   </w:abstractNum>
   <w:abstractNum w:abstractNumId="13">
+    <w:lvl w:ilvl="0">
+      <w:start w:val="1"/>
+      <w:numFmt w:val="decimal"/>
+      <w:lvlText w:val="%1."/>
+      <w:lvlJc w:val="start"/>
+      <w:pPr>
+        <w:tabs>
+          <w:tab w:val="num" w:pos="709"/>
+        </w:tabs>
+        <w:ind w:start="709" w:hanging="283"/>
+      </w:pPr>
+      <w:rPr/>
+    </w:lvl>
+    <w:lvl w:ilvl="1">
+      <w:start w:val="1"/>
+      <w:numFmt w:val="decimal"/>
+      <w:lvlText w:val="%2."/>
+      <w:lvlJc w:val="start"/>
+      <w:pPr>
+        <w:tabs>
+          <w:tab w:val="num" w:pos="1418"/>
+        </w:tabs>
+        <w:ind w:start="1418" w:hanging="283"/>
+      </w:pPr>
+      <w:rPr/>
+    </w:lvl>
+    <w:lvl w:ilvl="2">
+      <w:start w:val="1"/>
+      <w:numFmt w:val="decimal"/>
+      <w:lvlText w:val="%3."/>
+      <w:lvlJc w:val="start"/>
+      <w:pPr>
+        <w:tabs>
+          <w:tab w:val="num" w:pos="2127"/>
+        </w:tabs>
+        <w:ind w:start="2127" w:hanging="283"/>
+      </w:pPr>
+      <w:rPr/>
+    </w:lvl>
+    <w:lvl w:ilvl="3">
+      <w:start w:val="1"/>
+      <w:numFmt w:val="decimal"/>
+      <w:lvlText w:val="%4."/>
+      <w:lvlJc w:val="start"/>
+      <w:pPr>
+        <w:tabs>
+          <w:tab w:val="num" w:pos="2836"/>
+        </w:tabs>
+        <w:ind w:start="2836" w:hanging="283"/>
+      </w:pPr>
+      <w:rPr/>
+    </w:lvl>
+    <w:lvl w:ilvl="4">
+      <w:start w:val="1"/>
+      <w:numFmt w:val="decimal"/>
+      <w:lvlText w:val="%5."/>
+      <w:lvlJc w:val="start"/>
+      <w:pPr>
+        <w:tabs>
+          <w:tab w:val="num" w:pos="3545"/>
+        </w:tabs>
+        <w:ind w:start="3545" w:hanging="283"/>
+      </w:pPr>
+      <w:rPr/>
+    </w:lvl>
+    <w:lvl w:ilvl="5">
+      <w:start w:val="1"/>
+      <w:numFmt w:val="decimal"/>
+      <w:lvlText w:val="%6."/>
+      <w:lvlJc w:val="start"/>
+      <w:pPr>
+        <w:tabs>
+          <w:tab w:val="num" w:pos="4254"/>
+        </w:tabs>
+        <w:ind w:start="4254" w:hanging="283"/>
+      </w:pPr>
+      <w:rPr/>
+    </w:lvl>
+    <w:lvl w:ilvl="6">
+      <w:start w:val="1"/>
+      <w:numFmt w:val="decimal"/>
+      <w:lvlText w:val="%7."/>
+      <w:lvlJc w:val="start"/>
+      <w:pPr>
+        <w:tabs>
+          <w:tab w:val="num" w:pos="4963"/>
+        </w:tabs>
+        <w:ind w:start="4963" w:hanging="283"/>
+      </w:pPr>
+      <w:rPr/>
+    </w:lvl>
+    <w:lvl w:ilvl="7">
+      <w:start w:val="1"/>
+      <w:numFmt w:val="decimal"/>
+      <w:lvlText w:val="%8."/>
+      <w:lvlJc w:val="start"/>
+      <w:pPr>
+        <w:tabs>
+          <w:tab w:val="num" w:pos="5672"/>
+        </w:tabs>
+        <w:ind w:start="5672" w:hanging="283"/>
+      </w:pPr>
+      <w:rPr/>
+    </w:lvl>
+    <w:lvl w:ilvl="8">
+      <w:start w:val="1"/>
+      <w:numFmt w:val="decimal"/>
+      <w:lvlText w:val="%9."/>
+      <w:lvlJc w:val="start"/>
+      <w:pPr>
+        <w:tabs>
+          <w:tab w:val="num" w:pos="6381"/>
+        </w:tabs>
+        <w:ind w:start="6381" w:hanging="283"/>
+      </w:pPr>
+      <w:rPr/>
+    </w:lvl>
+  </w:abstractNum>
+  <w:abstractNum w:abstractNumId="14">
     <w:lvl w:ilvl="0">
       <w:start w:val="1"/>
       <w:numFmt w:val="none"/>
@@ -4989,6 +5230,9 @@
   <w:num w:numId="13">
     <w:abstractNumId w:val="13"/>
   </w:num>
+  <w:num w:numId="14">
+    <w:abstractNumId w:val="14"/>
+  </w:num>
 </w:numbering>
 </file>
 
@@ -5015,7 +5259,7 @@
     <w:pPr>
       <w:widowControl/>
       <w:suppressAutoHyphens w:val="true"/>
-      <w:overflowPunct w:val="true"/>
+      <w:overflowPunct w:val="false"/>
       <w:bidi w:val="0"/>
       <w:spacing w:before="0" w:after="0"/>
       <w:jc w:val="start"/>
@@ -5125,15 +5369,15 @@
       <w:u w:val="single"/>
     </w:rPr>
   </w:style>
-  <w:style w:type="character" w:styleId="FootnoteCharactersuser">
-    <w:name w:val="Footnote Characters (user)"/>
+  <w:style w:type="character" w:styleId="FootnoteCharacters">
+    <w:name w:val="Footnote Characters"/>
     <w:qFormat/>
     <w:rPr>
       <w:vertAlign w:val="superscript"/>
     </w:rPr>
   </w:style>
-  <w:style w:type="character" w:styleId="FootnoteCharacters">
-    <w:name w:val="Footnote Characters"/>
+  <w:style w:type="character" w:styleId="FootnoteCharactersuser">
+    <w:name w:val="Footnote Characters (user)"/>
     <w:qFormat/>
     <w:rPr>
       <w:vertAlign w:val="superscript"/>
@@ -5154,15 +5398,15 @@
       <w:szCs w:val="20"/>
     </w:rPr>
   </w:style>
-  <w:style w:type="character" w:styleId="EndnoteCharactersuser">
-    <w:name w:val="Endnote Characters (user)"/>
+  <w:style w:type="character" w:styleId="EndnoteCharacters">
+    <w:name w:val="Endnote Characters"/>
     <w:qFormat/>
     <w:rPr>
       <w:vertAlign w:val="superscript"/>
     </w:rPr>
   </w:style>
-  <w:style w:type="character" w:styleId="EndnoteCharacters">
-    <w:name w:val="Endnote Characters"/>
+  <w:style w:type="character" w:styleId="EndnoteCharactersuser">
+    <w:name w:val="Endnote Characters (user)"/>
     <w:qFormat/>
     <w:rPr>
       <w:vertAlign w:val="superscript"/>
@@ -5183,8 +5427,8 @@
       <w:szCs w:val="20"/>
     </w:rPr>
   </w:style>
-  <w:style w:type="character" w:styleId="Bullets">
-    <w:name w:val="Bullets"/>
+  <w:style w:type="character" w:styleId="Bulletsuser">
+    <w:name w:val="Bullets (user)"/>
     <w:qFormat/>
     <w:rPr>
       <w:rFonts w:ascii="OpenSymbol" w:hAnsi="OpenSymbol" w:eastAsia="OpenSymbol" w:cs="OpenSymbol"/>
@@ -5277,7 +5521,7 @@
     <w:pPr>
       <w:widowControl/>
       <w:suppressAutoHyphens w:val="true"/>
-      <w:overflowPunct w:val="true"/>
+      <w:overflowPunct w:val="false"/>
       <w:bidi w:val="0"/>
       <w:spacing w:before="0" w:after="0"/>
       <w:jc w:val="start"/>
@@ -5299,7 +5543,7 @@
     <w:pPr>
       <w:widowControl/>
       <w:suppressAutoHyphens w:val="true"/>
-      <w:overflowPunct w:val="true"/>
+      <w:overflowPunct w:val="false"/>
       <w:bidi w:val="0"/>
       <w:spacing w:before="0" w:after="0"/>
       <w:jc w:val="start"/>
@@ -5356,15 +5600,15 @@
     <w:pPr/>
     <w:rPr/>
   </w:style>
-  <w:style w:type="paragraph" w:styleId="FrameContents">
-    <w:name w:val="Frame Contents"/>
+  <w:style w:type="paragraph" w:styleId="FrameContentsuser">
+    <w:name w:val="Frame Contents (user)"/>
     <w:basedOn w:val="Normal"/>
     <w:qFormat/>
     <w:pPr/>
     <w:rPr/>
   </w:style>
-  <w:style w:type="paragraph" w:styleId="FrameContentsuser">
-    <w:name w:val="Frame Contents (user)"/>
+  <w:style w:type="paragraph" w:styleId="FrameContents">
+    <w:name w:val="Frame Contents"/>
     <w:basedOn w:val="Normal"/>
     <w:qFormat/>
     <w:pPr/>

</xml_diff>